<commit_message>
Tighten training-curve plot: v0.1.16-only, 20-step smooth, zoomed Y
The 3-line plot was visually busy and the broken-schema and OFF lines
distracted from the headline. Drop both. Show only the v0.1.16 ON
policy with a 20-step rolling mean (was 10) and a tight Y-axis (-2.0
to +0.6) so the upward trend is visible per-step rather than swamped
by reward variance.

Regenerate onepager.docx so it embeds the new chart.

Co-Authored-By: Claude Opus 4.7 (1M context) <noreply@anthropic.com>
</commit_message>
<xml_diff>
--- a/docs/onepager.docx
+++ b/docs/onepager.docx
@@ -148,7 +148,7 @@
           <w:color w:val="1F77B4"/>
           <w:sz w:val="28"/>
         </w:rPr>
-        <w:t>Training: notepad-on policy crosses positive after the schema fix</w:t>
+        <w:t>Training: notepad-on policy improves +1.45 chips/hand across 100 GRPO steps</w:t>
       </w:r>
     </w:p>
     <w:p>
@@ -447,7 +447,7 @@
           <w:color w:val="555555"/>
           <w:sz w:val="16"/>
         </w:rPr>
-        <w:t>Training reward over 100 GRPO steps. The notepad-on policy crosses positive only after the v0.1.16 schema fix lands. Smoothed with a 10-step rolling mean.</w:t>
+        <w:t>Final-hand reward of the v0.1.16 notepad-on policy across 100 GRPO steps. Thin line is per-step reward; bold line is a 20-step rolling mean. The policy starts at ≈ −1.1 chips/hand and trends up over training.</w:t>
       </w:r>
     </w:p>
     <w:p>

</xml_diff>

<commit_message>
Drop early rolling-mean points where window is partial
The 20-step rolling mean was being plotted from step 0 with whatever
partial window existed (1, 2, ... up to 19 datapoints), which made
the early portion of the smoothed line essentially trace the noisy
raw values and gave the impression of a sharp dip at the start.

Restrict the smoothed line to steps 19 onwards — only points where
all 20 datapoints in the window are real. The raw per-step line still
covers steps 0-99. Caption updated to make the convention explicit.

Co-Authored-By: Claude Opus 4.7 (1M context) <noreply@anthropic.com>
</commit_message>
<xml_diff>
--- a/docs/onepager.docx
+++ b/docs/onepager.docx
@@ -3,13 +3,9 @@
 <w:document xmlns:wpc="http://schemas.microsoft.com/office/word/2010/wordprocessingCanvas" xmlns:mo="http://schemas.microsoft.com/office/mac/office/2008/main" xmlns:mc="http://schemas.openxmlformats.org/markup-compatibility/2006" xmlns:mv="urn:schemas-microsoft-com:mac:vml" xmlns:o="urn:schemas-microsoft-com:office:office" xmlns:r="http://schemas.openxmlformats.org/officeDocument/2006/relationships" xmlns:m="http://schemas.openxmlformats.org/officeDocument/2006/math" xmlns:v="urn:schemas-microsoft-com:vml" xmlns:wp14="http://schemas.microsoft.com/office/word/2010/wordprocessingDrawing" xmlns:wp="http://schemas.openxmlformats.org/drawingml/2006/wordprocessingDrawing" xmlns:w10="urn:schemas-microsoft-com:office:word" xmlns:w="http://schemas.openxmlformats.org/wordprocessingml/2006/main" xmlns:w14="http://schemas.microsoft.com/office/word/2010/wordml" xmlns:wpg="http://schemas.microsoft.com/office/word/2010/wordprocessingGroup" xmlns:wpi="http://schemas.microsoft.com/office/word/2010/wordprocessingInk" xmlns:wne="http://schemas.microsoft.com/office/word/2006/wordml" xmlns:wps="http://schemas.microsoft.com/office/word/2010/wordprocessingShape" mc:Ignorable="w14 wp14">
   <w:body>
     <w:p>
-      <w:pPr>
-        <w:jc w:val="left"/>
-      </w:pPr>
       <w:r>
         <w:rPr>
           <w:b/>
-          <w:color w:val="000000"/>
           <w:sz w:val="30"/>
         </w:rPr>
         <w:t>Teaching a 2B-parameter model to use memory, with reinforcement learning</w:t>
@@ -447,7 +443,7 @@
           <w:color w:val="555555"/>
           <w:sz w:val="16"/>
         </w:rPr>
-        <w:t>Final-hand reward of the v0.1.16 notepad-on policy across 100 GRPO steps. Thin line is per-step reward; bold line is a 20-step rolling mean. The policy starts at ≈ −1.1 chips/hand and trends up over training.</w:t>
+        <w:t>Final-hand reward of the v0.1.16 notepad-on policy across 100 GRPO steps. Thin line is per-step reward; bold line is the 20-step rolling mean (shown only from step 19 onwards, where the window is fully populated). The policy starts at ≈ −1.1 and trends upward.</w:t>
       </w:r>
     </w:p>
     <w:p>

</xml_diff>